<commit_message>
Actualización de la pagina
</commit_message>
<xml_diff>
--- a/Documentacion/Evaluaciones/Evaluacion 3/3.1.2 Plan Pruebas Funcionales.docx
+++ b/Documentacion/Evaluaciones/Evaluacion 3/3.1.2 Plan Pruebas Funcionales.docx
@@ -150,23 +150,13 @@
           <w:szCs w:val="24"/>
         </w:rPr>
       </w:pPr>
-      <w:proofErr w:type="spellStart"/>
       <w:r>
         <w:rPr>
           <w:bCs w:val="0"/>
           <w:sz w:val="32"/>
           <w:szCs w:val="24"/>
         </w:rPr>
-        <w:t>ReservaFacil</w:t>
-      </w:r>
-      <w:proofErr w:type="spellEnd"/>
-      <w:r>
-        <w:rPr>
-          <w:bCs w:val="0"/>
-          <w:sz w:val="32"/>
-          <w:szCs w:val="24"/>
-        </w:rPr>
-        <w:t xml:space="preserve"> – Plataforma Web de Gestión de Reservas para Barbería</w:t>
+        <w:t>ReservaFacil – Plataforma Web de Gestión de Reservas para Barbería</w:t>
       </w:r>
     </w:p>
     <w:p>
@@ -190,15 +180,10 @@
         </w:rPr>
       </w:pPr>
       <w:r>
-        <w:t xml:space="preserve">Grupo </w:t>
+        <w:t xml:space="preserve">Grupo N° </w:t>
       </w:r>
-      <w:proofErr w:type="spellStart"/>
       <w:r>
-        <w:t>N°</w:t>
-      </w:r>
-      <w:proofErr w:type="spellEnd"/>
-      <w:r>
-        <w:t xml:space="preserve"> XX</w:t>
+        <w:t>1</w:t>
       </w:r>
     </w:p>
     <w:p>
@@ -358,13 +343,8 @@
                 <w:highlight w:val="yellow"/>
               </w:rPr>
             </w:pPr>
-            <w:proofErr w:type="spellStart"/>
-            <w:r>
-              <w:t>BarberShop</w:t>
-            </w:r>
-            <w:proofErr w:type="spellEnd"/>
-            <w:r>
-              <w:t>.</w:t>
+            <w:r>
+              <w:t>BarberShop.</w:t>
             </w:r>
             <w:r>
               <w:rPr>
@@ -636,7 +616,10 @@
               </w:rPr>
             </w:pPr>
             <w:r>
-              <w:t>1.0</w:t>
+              <w:t>1.</w:t>
+            </w:r>
+            <w:r>
+              <w:t>4</w:t>
             </w:r>
           </w:p>
         </w:tc>
@@ -924,17 +907,8 @@
                 <w:b/>
                 <w:bCs/>
               </w:rPr>
-              <w:t xml:space="preserve">Versión </w:t>
-            </w:r>
-            <w:proofErr w:type="spellStart"/>
-            <w:r>
-              <w:rPr>
-                <w:b/>
-                <w:bCs/>
-              </w:rPr>
-              <w:t>doc</w:t>
-            </w:r>
-            <w:proofErr w:type="spellEnd"/>
+              <w:t>Versión doc</w:t>
+            </w:r>
           </w:p>
         </w:tc>
         <w:tc>
@@ -1576,13 +1550,8 @@
               </w:rPr>
             </w:pPr>
             <w:r>
-              <w:t xml:space="preserve">Persistencia de usuarios y reservas en </w:t>
-            </w:r>
-            <w:proofErr w:type="spellStart"/>
-            <w:r>
-              <w:t>cloud</w:t>
-            </w:r>
-            <w:proofErr w:type="spellEnd"/>
+              <w:t>Persistencia de usuarios y reservas en cloud</w:t>
+            </w:r>
           </w:p>
         </w:tc>
         <w:tc>
@@ -2041,6 +2010,10 @@
     <w:p>
       <w:pPr>
         <w:pStyle w:val="Contents1"/>
+        <w:numPr>
+          <w:ilvl w:val="0"/>
+          <w:numId w:val="24"/>
+        </w:numPr>
         <w:tabs>
           <w:tab w:val="clear" w:pos="9128"/>
           <w:tab w:val="right" w:leader="dot" w:pos="9071"/>
@@ -2051,7 +2024,10 @@
       </w:pPr>
       <w:hyperlink w:anchor="__RefHeading__3782_904956992" w:history="1">
         <w:r>
-          <w:t>1 INTRODUCCIÓN</w:t>
+          <w:t>I</w:t>
+        </w:r>
+        <w:r>
+          <w:t>NTRODUCCIÓN</w:t>
         </w:r>
         <w:r>
           <w:tab/>
@@ -2209,11 +2185,6 @@
           <w:rFonts w:hint="eastAsia"/>
         </w:rPr>
       </w:pPr>
-      <w:hyperlink w:anchor="__RefHeading__3804_904956992" w:history="1">
-        <w:r>
-          <w:t>#__RefHeading__3804_904956992</w:t>
-        </w:r>
-      </w:hyperlink>
     </w:p>
     <w:p>
       <w:pPr>
@@ -2501,15 +2472,7 @@
       </w:r>
       <w:r>
         <w:tab/>
-        <w:t xml:space="preserve">Funcionamiento del sistema desplegado en ambiente </w:t>
-      </w:r>
-      <w:proofErr w:type="spellStart"/>
-      <w:r>
-        <w:t>cloud</w:t>
-      </w:r>
-      <w:proofErr w:type="spellEnd"/>
-      <w:r>
-        <w:t xml:space="preserve">. </w:t>
+        <w:t xml:space="preserve">Funcionamiento del sistema desplegado en ambiente cloud. </w:t>
       </w:r>
     </w:p>
     <w:p>
@@ -2612,6 +2575,7 @@
           <w:b/>
           <w:bCs/>
           <w:szCs w:val="20"/>
+          <w:u w:val="single"/>
         </w:rPr>
       </w:pPr>
     </w:p>
@@ -2626,7 +2590,7 @@
     </w:p>
     <w:tbl>
       <w:tblPr>
-        <w:tblW w:w="8359" w:type="dxa"/>
+        <w:tblW w:w="9492" w:type="dxa"/>
         <w:tblBorders>
           <w:top w:val="single" w:sz="4" w:space="0" w:color="auto"/>
           <w:left w:val="single" w:sz="4" w:space="0" w:color="auto"/>
@@ -2646,7 +2610,8 @@
         <w:gridCol w:w="1555"/>
         <w:gridCol w:w="2693"/>
         <w:gridCol w:w="2126"/>
-        <w:gridCol w:w="1985"/>
+        <w:gridCol w:w="1559"/>
+        <w:gridCol w:w="1559"/>
       </w:tblGrid>
       <w:tr>
         <w:tc>
@@ -2745,7 +2710,7 @@
         </w:tc>
         <w:tc>
           <w:tcPr>
-            <w:tcW w:w="1985" w:type="dxa"/>
+            <w:tcW w:w="1559" w:type="dxa"/>
             <w:shd w:val="clear" w:color="auto" w:fill="999999"/>
             <w:tcMar>
               <w:top w:w="55" w:type="dxa"/>
@@ -2774,6 +2739,30 @@
             </w:r>
           </w:p>
         </w:tc>
+        <w:tc>
+          <w:tcPr>
+            <w:tcW w:w="1559" w:type="dxa"/>
+            <w:shd w:val="clear" w:color="auto" w:fill="999999"/>
+          </w:tcPr>
+          <w:p>
+            <w:pPr>
+              <w:pStyle w:val="TableContents"/>
+              <w:jc w:val="center"/>
+              <w:rPr>
+                <w:rFonts w:hint="eastAsia"/>
+                <w:b/>
+                <w:bCs/>
+              </w:rPr>
+            </w:pPr>
+            <w:r>
+              <w:rPr>
+                <w:b/>
+                <w:bCs/>
+              </w:rPr>
+              <w:t>Ciclo 4</w:t>
+            </w:r>
+          </w:p>
+        </w:tc>
       </w:tr>
       <w:tr>
         <w:tc>
@@ -2855,7 +2844,7 @@
         </w:tc>
         <w:tc>
           <w:tcPr>
-            <w:tcW w:w="1985" w:type="dxa"/>
+            <w:tcW w:w="1559" w:type="dxa"/>
             <w:tcMar>
               <w:top w:w="55" w:type="dxa"/>
               <w:left w:w="55" w:type="dxa"/>
@@ -2879,6 +2868,21 @@
             </w:r>
           </w:p>
         </w:tc>
+        <w:tc>
+          <w:tcPr>
+            <w:tcW w:w="1559" w:type="dxa"/>
+            <w:vAlign w:val="center"/>
+          </w:tcPr>
+          <w:p>
+            <w:pPr>
+              <w:pStyle w:val="TableContents"/>
+              <w:jc w:val="center"/>
+              <w:rPr>
+                <w:rFonts w:hint="eastAsia"/>
+              </w:rPr>
+            </w:pPr>
+          </w:p>
+        </w:tc>
       </w:tr>
       <w:tr>
         <w:tc>
@@ -2960,7 +2964,7 @@
         </w:tc>
         <w:tc>
           <w:tcPr>
-            <w:tcW w:w="1985" w:type="dxa"/>
+            <w:tcW w:w="1559" w:type="dxa"/>
             <w:tcMar>
               <w:top w:w="55" w:type="dxa"/>
               <w:left w:w="55" w:type="dxa"/>
@@ -2984,6 +2988,21 @@
             </w:r>
           </w:p>
         </w:tc>
+        <w:tc>
+          <w:tcPr>
+            <w:tcW w:w="1559" w:type="dxa"/>
+            <w:vAlign w:val="center"/>
+          </w:tcPr>
+          <w:p>
+            <w:pPr>
+              <w:pStyle w:val="TableContents"/>
+              <w:jc w:val="center"/>
+              <w:rPr>
+                <w:rFonts w:hint="eastAsia"/>
+              </w:rPr>
+            </w:pPr>
+          </w:p>
+        </w:tc>
       </w:tr>
       <w:tr>
         <w:tc>
@@ -3009,7 +3028,7 @@
               </w:rPr>
             </w:pPr>
             <w:r>
-              <w:t>CP-003 Crear Reserva</w:t>
+              <w:t>CP-03 Crear Reserva</w:t>
             </w:r>
           </w:p>
         </w:tc>
@@ -3067,7 +3086,7 @@
         </w:tc>
         <w:tc>
           <w:tcPr>
-            <w:tcW w:w="1985" w:type="dxa"/>
+            <w:tcW w:w="1559" w:type="dxa"/>
             <w:tcMar>
               <w:top w:w="55" w:type="dxa"/>
               <w:left w:w="55" w:type="dxa"/>
@@ -3091,6 +3110,21 @@
             </w:r>
           </w:p>
         </w:tc>
+        <w:tc>
+          <w:tcPr>
+            <w:tcW w:w="1559" w:type="dxa"/>
+            <w:vAlign w:val="center"/>
+          </w:tcPr>
+          <w:p>
+            <w:pPr>
+              <w:pStyle w:val="TableContents"/>
+              <w:jc w:val="center"/>
+              <w:rPr>
+                <w:rFonts w:hint="eastAsia"/>
+              </w:rPr>
+            </w:pPr>
+          </w:p>
+        </w:tc>
       </w:tr>
       <w:tr>
         <w:tc>
@@ -3116,7 +3150,7 @@
               </w:rPr>
             </w:pPr>
             <w:r>
-              <w:t>CP-004 Visualizar Agenda</w:t>
+              <w:t>CP-04 Visualizar Agenda</w:t>
             </w:r>
           </w:p>
         </w:tc>
@@ -3174,7 +3208,7 @@
         </w:tc>
         <w:tc>
           <w:tcPr>
-            <w:tcW w:w="1985" w:type="dxa"/>
+            <w:tcW w:w="1559" w:type="dxa"/>
             <w:tcMar>
               <w:top w:w="55" w:type="dxa"/>
               <w:left w:w="55" w:type="dxa"/>
@@ -3198,6 +3232,21 @@
             </w:r>
           </w:p>
         </w:tc>
+        <w:tc>
+          <w:tcPr>
+            <w:tcW w:w="1559" w:type="dxa"/>
+            <w:vAlign w:val="center"/>
+          </w:tcPr>
+          <w:p>
+            <w:pPr>
+              <w:pStyle w:val="TableContents"/>
+              <w:jc w:val="center"/>
+              <w:rPr>
+                <w:rFonts w:hint="eastAsia"/>
+              </w:rPr>
+            </w:pPr>
+          </w:p>
+        </w:tc>
       </w:tr>
       <w:tr>
         <w:tc>
@@ -3223,7 +3272,7 @@
               </w:rPr>
             </w:pPr>
             <w:r>
-              <w:t>CP-005 Eliminar Reserva</w:t>
+              <w:t>CP-05 Eliminar Reserva</w:t>
             </w:r>
           </w:p>
         </w:tc>
@@ -3278,7 +3327,7 @@
         </w:tc>
         <w:tc>
           <w:tcPr>
-            <w:tcW w:w="1985" w:type="dxa"/>
+            <w:tcW w:w="1559" w:type="dxa"/>
             <w:tcMar>
               <w:top w:w="55" w:type="dxa"/>
               <w:left w:w="55" w:type="dxa"/>
@@ -3302,6 +3351,21 @@
             </w:r>
           </w:p>
         </w:tc>
+        <w:tc>
+          <w:tcPr>
+            <w:tcW w:w="1559" w:type="dxa"/>
+            <w:vAlign w:val="center"/>
+          </w:tcPr>
+          <w:p>
+            <w:pPr>
+              <w:pStyle w:val="TableContents"/>
+              <w:jc w:val="center"/>
+              <w:rPr>
+                <w:rFonts w:hint="eastAsia"/>
+              </w:rPr>
+            </w:pPr>
+          </w:p>
+        </w:tc>
       </w:tr>
       <w:tr>
         <w:tc>
@@ -3382,7 +3446,7 @@
         </w:tc>
         <w:tc>
           <w:tcPr>
-            <w:tcW w:w="1985" w:type="dxa"/>
+            <w:tcW w:w="1559" w:type="dxa"/>
             <w:tcMar>
               <w:top w:w="55" w:type="dxa"/>
               <w:left w:w="55" w:type="dxa"/>
@@ -3406,6 +3470,24 @@
             </w:r>
           </w:p>
         </w:tc>
+        <w:tc>
+          <w:tcPr>
+            <w:tcW w:w="1559" w:type="dxa"/>
+            <w:vAlign w:val="center"/>
+          </w:tcPr>
+          <w:p>
+            <w:pPr>
+              <w:pStyle w:val="TableContents"/>
+              <w:jc w:val="center"/>
+              <w:rPr>
+                <w:rFonts w:hint="eastAsia"/>
+              </w:rPr>
+            </w:pPr>
+            <w:r>
+              <w:t>X</w:t>
+            </w:r>
+          </w:p>
+        </w:tc>
       </w:tr>
       <w:tr>
         <w:tc>
@@ -3429,15 +3511,7 @@
               </w:rPr>
             </w:pPr>
             <w:r>
-              <w:t xml:space="preserve">CP-07: Validación de despliegue </w:t>
-            </w:r>
-            <w:proofErr w:type="spellStart"/>
-            <w:r>
-              <w:t>cloud</w:t>
-            </w:r>
-            <w:proofErr w:type="spellEnd"/>
-            <w:r>
-              <w:t xml:space="preserve"> en Render.</w:t>
+              <w:t>CP-07: Validación de despliegue cloud en Render.</w:t>
             </w:r>
           </w:p>
         </w:tc>
@@ -3490,7 +3564,7 @@
         </w:tc>
         <w:tc>
           <w:tcPr>
-            <w:tcW w:w="1985" w:type="dxa"/>
+            <w:tcW w:w="1559" w:type="dxa"/>
             <w:tcMar>
               <w:top w:w="55" w:type="dxa"/>
               <w:left w:w="55" w:type="dxa"/>
@@ -3512,6 +3586,24 @@
             </w:r>
           </w:p>
         </w:tc>
+        <w:tc>
+          <w:tcPr>
+            <w:tcW w:w="1559" w:type="dxa"/>
+            <w:vAlign w:val="center"/>
+          </w:tcPr>
+          <w:p>
+            <w:pPr>
+              <w:pStyle w:val="TableContents"/>
+              <w:jc w:val="center"/>
+              <w:rPr>
+                <w:rFonts w:hint="eastAsia"/>
+              </w:rPr>
+            </w:pPr>
+            <w:r>
+              <w:t>X</w:t>
+            </w:r>
+          </w:p>
+        </w:tc>
       </w:tr>
       <w:tr>
         <w:tc>
@@ -3535,7 +3627,10 @@
               </w:rPr>
             </w:pPr>
             <w:r>
-              <w:t>CP-008 Despliegue Cloud</w:t>
+              <w:t xml:space="preserve">CP-08 </w:t>
+            </w:r>
+            <w:r>
+              <w:t>Persistencia de Usuarios PostgreSQL</w:t>
             </w:r>
           </w:p>
         </w:tc>
@@ -3581,11 +3676,14 @@
                 <w:rFonts w:hint="eastAsia"/>
               </w:rPr>
             </w:pPr>
-          </w:p>
-        </w:tc>
-        <w:tc>
-          <w:tcPr>
-            <w:tcW w:w="1985" w:type="dxa"/>
+            <w:r>
+              <w:t>x</w:t>
+            </w:r>
+          </w:p>
+        </w:tc>
+        <w:tc>
+          <w:tcPr>
+            <w:tcW w:w="1559" w:type="dxa"/>
             <w:tcMar>
               <w:top w:w="55" w:type="dxa"/>
               <w:left w:w="55" w:type="dxa"/>
@@ -3607,6 +3705,24 @@
             </w:r>
           </w:p>
         </w:tc>
+        <w:tc>
+          <w:tcPr>
+            <w:tcW w:w="1559" w:type="dxa"/>
+            <w:vAlign w:val="center"/>
+          </w:tcPr>
+          <w:p>
+            <w:pPr>
+              <w:pStyle w:val="TableContents"/>
+              <w:jc w:val="center"/>
+              <w:rPr>
+                <w:rFonts w:hint="eastAsia"/>
+              </w:rPr>
+            </w:pPr>
+            <w:r>
+              <w:t>X</w:t>
+            </w:r>
+          </w:p>
+        </w:tc>
       </w:tr>
       <w:tr>
         <w:tc>
@@ -3683,7 +3799,7 @@
         </w:tc>
         <w:tc>
           <w:tcPr>
-            <w:tcW w:w="1985" w:type="dxa"/>
+            <w:tcW w:w="1559" w:type="dxa"/>
             <w:tcMar>
               <w:top w:w="55" w:type="dxa"/>
               <w:left w:w="55" w:type="dxa"/>
@@ -3705,6 +3821,24 @@
             </w:r>
           </w:p>
         </w:tc>
+        <w:tc>
+          <w:tcPr>
+            <w:tcW w:w="1559" w:type="dxa"/>
+            <w:vAlign w:val="center"/>
+          </w:tcPr>
+          <w:p>
+            <w:pPr>
+              <w:pStyle w:val="TableContents"/>
+              <w:jc w:val="center"/>
+              <w:rPr>
+                <w:rFonts w:hint="eastAsia"/>
+              </w:rPr>
+            </w:pPr>
+            <w:r>
+              <w:t>x</w:t>
+            </w:r>
+          </w:p>
+        </w:tc>
       </w:tr>
       <w:tr>
         <w:tc>
@@ -3728,13 +3862,8 @@
               </w:rPr>
             </w:pPr>
             <w:r>
-              <w:t xml:space="preserve">CP-10 – Visualización de Usuarios en Django </w:t>
-            </w:r>
-            <w:proofErr w:type="spellStart"/>
-            <w:r>
-              <w:t>Admin</w:t>
-            </w:r>
-            <w:proofErr w:type="spellEnd"/>
+              <w:t>CP-10 – Visualización de Usuarios en Django Admin</w:t>
+            </w:r>
           </w:p>
           <w:p>
             <w:pPr>
@@ -3792,7 +3921,7 @@
         </w:tc>
         <w:tc>
           <w:tcPr>
-            <w:tcW w:w="1985" w:type="dxa"/>
+            <w:tcW w:w="1559" w:type="dxa"/>
             <w:tcMar>
               <w:top w:w="55" w:type="dxa"/>
               <w:left w:w="55" w:type="dxa"/>
@@ -3815,6 +3944,24 @@
             </w:r>
           </w:p>
         </w:tc>
+        <w:tc>
+          <w:tcPr>
+            <w:tcW w:w="1559" w:type="dxa"/>
+            <w:vAlign w:val="center"/>
+          </w:tcPr>
+          <w:p>
+            <w:pPr>
+              <w:pStyle w:val="TableContents"/>
+              <w:jc w:val="center"/>
+              <w:rPr>
+                <w:rFonts w:hint="eastAsia"/>
+              </w:rPr>
+            </w:pPr>
+            <w:r>
+              <w:t>x</w:t>
+            </w:r>
+          </w:p>
+        </w:tc>
       </w:tr>
     </w:tbl>
     <w:p>
@@ -3880,15 +4027,7 @@
         </w:rPr>
       </w:pPr>
       <w:r>
-        <w:t xml:space="preserve">Las pruebas contemplan funcionalidades como el registro e inicio de sesión de usuarios, creación y administración de reservas, visualización de agenda, eliminación de reservas, procesamiento de pagos mediante Stripe Sandbox y acceso al sistema a través del entorno </w:t>
-      </w:r>
-      <w:proofErr w:type="spellStart"/>
-      <w:r>
-        <w:t>cloud</w:t>
-      </w:r>
-      <w:proofErr w:type="spellEnd"/>
-      <w:r>
-        <w:t xml:space="preserve"> desplegado en Render.</w:t>
+        <w:t>Las pruebas contemplan funcionalidades como el registro e inicio de sesión de usuarios, creación y administración de reservas, visualización de agenda, eliminación de reservas, procesamiento de pagos mediante Stripe Sandbox y acceso al sistema a través del entorno cloud desplegado en Render.</w:t>
       </w:r>
     </w:p>
     <w:p>
@@ -3930,15 +4069,7 @@
         </w:rPr>
       </w:pPr>
       <w:r>
-        <w:t xml:space="preserve">Las pruebas fueron ejecutadas tanto en ambiente local como en ambiente </w:t>
-      </w:r>
-      <w:proofErr w:type="spellStart"/>
-      <w:r>
-        <w:t>cloud</w:t>
-      </w:r>
-      <w:proofErr w:type="spellEnd"/>
-      <w:r>
-        <w:t>, utilizando las tecnologías implementadas en el proyecto: Django 6, Python 3.11, SQLite, Stripe Sandbox y Render.</w:t>
+        <w:t>Las pruebas fueron ejecutadas tanto en ambiente local como en ambiente cloud, utilizando las tecnologías implementadas en el proyecto: Django 6, Python 3.11, SQLite, Stripe Sandbox y Render.</w:t>
       </w:r>
     </w:p>
     <w:p>
@@ -4052,15 +4183,7 @@
         </w:rPr>
       </w:pPr>
       <w:r>
-        <w:t xml:space="preserve">• CP-07: Validación de despliegue </w:t>
-      </w:r>
-      <w:proofErr w:type="spellStart"/>
-      <w:r>
-        <w:t>cloud</w:t>
-      </w:r>
-      <w:proofErr w:type="spellEnd"/>
-      <w:r>
-        <w:t xml:space="preserve"> en Render.</w:t>
+        <w:t>• CP-07: Validación de despliegue cloud en Render.</w:t>
       </w:r>
     </w:p>
     <w:p>
@@ -4105,13 +4228,8 @@
         <w:t xml:space="preserve">• </w:t>
       </w:r>
       <w:r>
-        <w:t xml:space="preserve">CP-10 – Visualización de Usuarios en Django </w:t>
+        <w:t>CP-10 – Visualización de Usuarios en Django Admin</w:t>
       </w:r>
-      <w:proofErr w:type="spellStart"/>
-      <w:r>
-        <w:t>Admin</w:t>
-      </w:r>
-      <w:proofErr w:type="spellEnd"/>
     </w:p>
     <w:p>
       <w:pPr>
@@ -4426,12 +4544,13 @@
           <w:p>
             <w:pPr>
               <w:pStyle w:val="TableHeading"/>
-              <w:rPr>
-                <w:rFonts w:hint="eastAsia"/>
-              </w:rPr>
-            </w:pPr>
-            <w:r>
-              <w:t>PF</w:t>
+              <w:jc w:val="left"/>
+              <w:rPr>
+                <w:rFonts w:hint="eastAsia"/>
+              </w:rPr>
+            </w:pPr>
+            <w:r>
+              <w:t xml:space="preserve">  CP</w:t>
             </w:r>
             <w:r>
               <w:t>-01</w:t>
@@ -4512,6 +4631,9 @@
                 <w:rFonts w:hint="eastAsia"/>
               </w:rPr>
             </w:pPr>
+            <w:r>
+              <w:t>si</w:t>
+            </w:r>
           </w:p>
         </w:tc>
       </w:tr>
@@ -4630,25 +4752,7 @@
                 <w:bCs/>
                 <w:color w:val="000000"/>
               </w:rPr>
-              <w:t xml:space="preserve">Sistema </w:t>
-            </w:r>
-            <w:proofErr w:type="spellStart"/>
-            <w:r>
-              <w:rPr>
-                <w:b/>
-                <w:bCs/>
-                <w:color w:val="000000"/>
-              </w:rPr>
-              <w:t>ReservaFacil</w:t>
-            </w:r>
-            <w:proofErr w:type="spellEnd"/>
-            <w:r>
-              <w:rPr>
-                <w:b/>
-                <w:bCs/>
-                <w:color w:val="000000"/>
-              </w:rPr>
-              <w:t xml:space="preserve"> disponible.</w:t>
+              <w:t>Sistema ReservaFacil disponible.</w:t>
             </w:r>
           </w:p>
           <w:p>
@@ -4908,23 +5012,7 @@
                 <w:b/>
                 <w:bCs/>
               </w:rPr>
-              <w:t xml:space="preserve">El sistema crea correctamente el usuario y permite acceder posteriormente mediante </w:t>
-            </w:r>
-            <w:proofErr w:type="spellStart"/>
-            <w:r>
-              <w:rPr>
-                <w:b/>
-                <w:bCs/>
-              </w:rPr>
-              <w:t>login</w:t>
-            </w:r>
-            <w:proofErr w:type="spellEnd"/>
-            <w:r>
-              <w:rPr>
-                <w:b/>
-                <w:bCs/>
-              </w:rPr>
-              <w:t>.</w:t>
+              <w:t>El sistema crea correctamente el usuario y permite acceder posteriormente mediante login.</w:t>
             </w:r>
           </w:p>
           <w:p>
@@ -5115,7 +5203,7 @@
               </w:rPr>
             </w:pPr>
             <w:r>
-              <w:t>PF</w:t>
+              <w:t>CP</w:t>
             </w:r>
             <w:r>
               <w:t xml:space="preserve"> </w:t>
@@ -5199,6 +5287,9 @@
                 <w:rFonts w:hint="eastAsia"/>
               </w:rPr>
             </w:pPr>
+            <w:r>
+              <w:t>si</w:t>
+            </w:r>
           </w:p>
         </w:tc>
       </w:tr>
@@ -5593,7 +5684,35 @@
                 <w:b/>
                 <w:bCs/>
               </w:rPr>
-              <w:t>El usuario accede correctamente al panel principal.</w:t>
+              <w:t>El usuario accede correctamente al panel principal</w:t>
+            </w:r>
+            <w:r>
+              <w:rPr>
+                <w:b/>
+                <w:bCs/>
+              </w:rPr>
+              <w:t xml:space="preserve"> y l</w:t>
+            </w:r>
+            <w:r>
+              <w:rPr>
+                <w:b/>
+                <w:bCs/>
+              </w:rPr>
+              <w:t xml:space="preserve">a autenticación </w:t>
+            </w:r>
+            <w:r>
+              <w:rPr>
+                <w:b/>
+                <w:bCs/>
+              </w:rPr>
+              <w:t>sera</w:t>
+            </w:r>
+            <w:r>
+              <w:rPr>
+                <w:b/>
+                <w:bCs/>
+              </w:rPr>
+              <w:t xml:space="preserve"> gestionada mediante Django Authentication utilizando sesiones seguras.</w:t>
             </w:r>
           </w:p>
           <w:p>
@@ -5720,7 +5839,7 @@
               </w:rPr>
             </w:pPr>
             <w:r>
-              <w:t>PF</w:t>
+              <w:t>CP</w:t>
             </w:r>
             <w:r>
               <w:t xml:space="preserve"> </w:t>
@@ -5807,6 +5926,9 @@
                 <w:rFonts w:hint="eastAsia"/>
               </w:rPr>
             </w:pPr>
+            <w:r>
+              <w:t>si</w:t>
+            </w:r>
           </w:p>
         </w:tc>
       </w:tr>
@@ -6346,7 +6468,7 @@
               </w:rPr>
             </w:pPr>
             <w:r>
-              <w:t>PF</w:t>
+              <w:t>CP</w:t>
             </w:r>
             <w:r>
               <w:t xml:space="preserve"> </w:t>
@@ -6430,6 +6552,9 @@
                 <w:rFonts w:hint="eastAsia"/>
               </w:rPr>
             </w:pPr>
+            <w:r>
+              <w:t>si</w:t>
+            </w:r>
           </w:p>
         </w:tc>
       </w:tr>
@@ -6902,7 +7027,7 @@
               </w:rPr>
             </w:pPr>
             <w:r>
-              <w:t>Visualización de Agenda</w:t>
+              <w:t>Eliminación de Reserva</w:t>
             </w:r>
           </w:p>
         </w:tc>
@@ -6961,7 +7086,7 @@
               </w:rPr>
             </w:pPr>
             <w:r>
-              <w:t>PF</w:t>
+              <w:t>CP</w:t>
             </w:r>
             <w:r>
               <w:t xml:space="preserve"> </w:t>
@@ -7048,6 +7173,9 @@
                 <w:rFonts w:hint="eastAsia"/>
               </w:rPr>
             </w:pPr>
+            <w:r>
+              <w:t>si</w:t>
+            </w:r>
           </w:p>
         </w:tc>
       </w:tr>
@@ -7587,7 +7715,7 @@
               </w:rPr>
             </w:pPr>
             <w:r>
-              <w:t>PF</w:t>
+              <w:t>CP</w:t>
             </w:r>
             <w:r>
               <w:t xml:space="preserve"> -</w:t>
@@ -8011,23 +8139,7 @@
                 <w:b/>
                 <w:bCs/>
               </w:rPr>
-              <w:t xml:space="preserve">Stripe genera Payment </w:t>
-            </w:r>
-            <w:proofErr w:type="spellStart"/>
-            <w:r>
-              <w:rPr>
-                <w:b/>
-                <w:bCs/>
-              </w:rPr>
-              <w:t>Intent</w:t>
-            </w:r>
-            <w:proofErr w:type="spellEnd"/>
-            <w:r>
-              <w:rPr>
-                <w:b/>
-                <w:bCs/>
-              </w:rPr>
-              <w:t xml:space="preserve"> y procesa la transacción.</w:t>
+              <w:t>Stripe genera Payment Intent y procesa la transacción.</w:t>
             </w:r>
           </w:p>
           <w:p>
@@ -8092,7 +8204,21 @@
                 <w:b/>
                 <w:bCs/>
               </w:rPr>
-              <w:t>Pago procesado correctamente en ambiente Sandbox.</w:t>
+              <w:t>Pago procesado correctamente en ambiente Sandbox</w:t>
+            </w:r>
+            <w:r>
+              <w:rPr>
+                <w:b/>
+                <w:bCs/>
+              </w:rPr>
+              <w:t xml:space="preserve"> y </w:t>
+            </w:r>
+            <w:r>
+              <w:rPr>
+                <w:b/>
+                <w:bCs/>
+              </w:rPr>
+              <w:t>Stripe genera un Payment Intent para validar y procesar la transacción de manera segura antes de confirmar el pago</w:t>
             </w:r>
           </w:p>
           <w:p>
@@ -8242,7 +8368,7 @@
               </w:rPr>
             </w:pPr>
             <w:r>
-              <w:t>PF</w:t>
+              <w:t>CP</w:t>
             </w:r>
             <w:r>
               <w:t xml:space="preserve"> </w:t>
@@ -8694,23 +8820,7 @@
                 <w:b/>
                 <w:bCs/>
               </w:rPr>
-              <w:t xml:space="preserve">El sistema funciona correctamente en ambiente </w:t>
-            </w:r>
-            <w:proofErr w:type="spellStart"/>
-            <w:r>
-              <w:rPr>
-                <w:b/>
-                <w:bCs/>
-              </w:rPr>
-              <w:t>cloud</w:t>
-            </w:r>
-            <w:proofErr w:type="spellEnd"/>
-            <w:r>
-              <w:rPr>
-                <w:b/>
-                <w:bCs/>
-              </w:rPr>
-              <w:t>.</w:t>
+              <w:t>El sistema funciona correctamente en ambiente cloud.</w:t>
             </w:r>
           </w:p>
           <w:p>
@@ -8836,7 +8946,7 @@
               </w:rPr>
             </w:pPr>
             <w:r>
-              <w:t>PF</w:t>
+              <w:t>CP</w:t>
             </w:r>
             <w:r>
               <w:t xml:space="preserve"> </w:t>
@@ -9452,7 +9562,6 @@
               </w:rPr>
             </w:pPr>
             <w:r>
-              <w:lastRenderedPageBreak/>
               <w:t>Persistencia de Reservas PostgreSQL</w:t>
             </w:r>
           </w:p>
@@ -9512,7 +9621,7 @@
               </w:rPr>
             </w:pPr>
             <w:r>
-              <w:t>PF</w:t>
+              <w:t>CP</w:t>
             </w:r>
             <w:r>
               <w:t xml:space="preserve"> </w:t>
@@ -10046,13 +10155,8 @@
               </w:rPr>
             </w:pPr>
             <w:r>
-              <w:t xml:space="preserve">Visualización de Usuarios en Django </w:t>
-            </w:r>
-            <w:proofErr w:type="spellStart"/>
-            <w:r>
-              <w:t>Admin</w:t>
-            </w:r>
-            <w:proofErr w:type="spellEnd"/>
+              <w:t>Visualización de Usuarios en Django Admin</w:t>
+            </w:r>
           </w:p>
         </w:tc>
         <w:tc>
@@ -10110,7 +10214,7 @@
               </w:rPr>
             </w:pPr>
             <w:r>
-              <w:t>PF</w:t>
+              <w:t>CP</w:t>
             </w:r>
             <w:r>
               <w:t xml:space="preserve"> </w:t>
@@ -10443,23 +10547,7 @@
                 <w:b/>
                 <w:bCs/>
               </w:rPr>
-              <w:t xml:space="preserve">3. Acceder al módulo </w:t>
-            </w:r>
-            <w:proofErr w:type="spellStart"/>
-            <w:r>
-              <w:rPr>
-                <w:b/>
-                <w:bCs/>
-              </w:rPr>
-              <w:t>Users</w:t>
-            </w:r>
-            <w:proofErr w:type="spellEnd"/>
-            <w:r>
-              <w:rPr>
-                <w:b/>
-                <w:bCs/>
-              </w:rPr>
-              <w:t>.</w:t>
+              <w:t>3. Acceder al módulo Users.</w:t>
             </w:r>
           </w:p>
           <w:p>
@@ -10641,15 +10729,7 @@
         </w:rPr>
       </w:pPr>
       <w:r>
-        <w:t xml:space="preserve">Con el objetivo de validar el correcto funcionamiento de ReservaFacil-BarberShop, las pruebas fueron organizadas en distintos ciclos de ejecución. Esta estrategia permite verificar progresivamente cada una de las funcionalidades implementadas durante la Fase 2, comenzando por los módulos básicos de acceso al sistema y finalizando con las pruebas de integración y despliegue </w:t>
-      </w:r>
-      <w:proofErr w:type="spellStart"/>
-      <w:r>
-        <w:t>cloud</w:t>
-      </w:r>
-      <w:proofErr w:type="spellEnd"/>
-      <w:r>
-        <w:t>.</w:t>
+        <w:t>Con el objetivo de validar el correcto funcionamiento de ReservaFacil-BarberShop, las pruebas fueron organizadas en distintos ciclos de ejecución. Esta estrategia permite verificar progresivamente cada una de las funcionalidades implementadas durante la Fase 2, comenzando por los módulos básicos de acceso al sistema y finalizando con las pruebas de integración y despliegue cloud.</w:t>
       </w:r>
     </w:p>
     <w:p>
@@ -10701,7 +10781,7 @@
     </w:p>
     <w:tbl>
       <w:tblPr>
-        <w:tblW w:w="5240" w:type="dxa"/>
+        <w:tblW w:w="6657" w:type="dxa"/>
         <w:tblInd w:w="1622" w:type="dxa"/>
         <w:tblBorders>
           <w:top w:val="single" w:sz="4" w:space="0" w:color="auto"/>
@@ -10723,6 +10803,7 @@
         <w:gridCol w:w="993"/>
         <w:gridCol w:w="1134"/>
         <w:gridCol w:w="1417"/>
+        <w:gridCol w:w="1417"/>
       </w:tblGrid>
       <w:tr>
         <w:tc>
@@ -10845,6 +10926,28 @@
             </w:r>
           </w:p>
         </w:tc>
+        <w:tc>
+          <w:tcPr>
+            <w:tcW w:w="1417" w:type="dxa"/>
+          </w:tcPr>
+          <w:p>
+            <w:pPr>
+              <w:pStyle w:val="TableContents"/>
+              <w:jc w:val="center"/>
+              <w:rPr>
+                <w:b/>
+                <w:bCs/>
+              </w:rPr>
+            </w:pPr>
+            <w:r>
+              <w:rPr>
+                <w:b/>
+                <w:bCs/>
+              </w:rPr>
+              <w:t>Ciclo 4</w:t>
+            </w:r>
+          </w:p>
+        </w:tc>
       </w:tr>
       <w:tr>
         <w:tc>
@@ -10869,13 +10972,7 @@
               </w:rPr>
             </w:pPr>
             <w:r>
-              <w:t>PF</w:t>
-            </w:r>
-            <w:r>
-              <w:t xml:space="preserve"> </w:t>
-            </w:r>
-            <w:r>
-              <w:t>-01 Registro de Usuario</w:t>
+              <w:t>PF -01 Registro de Usuario</w:t>
             </w:r>
           </w:p>
         </w:tc>
@@ -10945,6 +11042,20 @@
             </w:pPr>
           </w:p>
         </w:tc>
+        <w:tc>
+          <w:tcPr>
+            <w:tcW w:w="1417" w:type="dxa"/>
+          </w:tcPr>
+          <w:p>
+            <w:pPr>
+              <w:pStyle w:val="TableContents"/>
+              <w:jc w:val="center"/>
+              <w:rPr>
+                <w:rFonts w:hint="eastAsia"/>
+              </w:rPr>
+            </w:pPr>
+          </w:p>
+        </w:tc>
       </w:tr>
       <w:tr>
         <w:tc>
@@ -10969,13 +11080,7 @@
               </w:rPr>
             </w:pPr>
             <w:r>
-              <w:t>PF</w:t>
-            </w:r>
-            <w:r>
-              <w:t xml:space="preserve"> </w:t>
-            </w:r>
-            <w:r>
-              <w:t>-02 Inicio de Sesión</w:t>
+              <w:t>PF -02 Inicio de Sesión</w:t>
             </w:r>
           </w:p>
         </w:tc>
@@ -11045,6 +11150,20 @@
             </w:pPr>
           </w:p>
         </w:tc>
+        <w:tc>
+          <w:tcPr>
+            <w:tcW w:w="1417" w:type="dxa"/>
+          </w:tcPr>
+          <w:p>
+            <w:pPr>
+              <w:pStyle w:val="TableContents"/>
+              <w:jc w:val="center"/>
+              <w:rPr>
+                <w:rFonts w:hint="eastAsia"/>
+              </w:rPr>
+            </w:pPr>
+          </w:p>
+        </w:tc>
       </w:tr>
       <w:tr>
         <w:tc>
@@ -11069,13 +11188,7 @@
               </w:rPr>
             </w:pPr>
             <w:r>
-              <w:t>PF</w:t>
-            </w:r>
-            <w:r>
-              <w:t xml:space="preserve"> </w:t>
-            </w:r>
-            <w:r>
-              <w:t>-03 Creación de Reserva</w:t>
+              <w:t>PF -03 Creación de Reserva</w:t>
             </w:r>
           </w:p>
         </w:tc>
@@ -11145,6 +11258,20 @@
             </w:pPr>
           </w:p>
         </w:tc>
+        <w:tc>
+          <w:tcPr>
+            <w:tcW w:w="1417" w:type="dxa"/>
+          </w:tcPr>
+          <w:p>
+            <w:pPr>
+              <w:pStyle w:val="TableContents"/>
+              <w:jc w:val="center"/>
+              <w:rPr>
+                <w:rFonts w:hint="eastAsia"/>
+              </w:rPr>
+            </w:pPr>
+          </w:p>
+        </w:tc>
       </w:tr>
       <w:tr>
         <w:tc>
@@ -11169,13 +11296,7 @@
               </w:rPr>
             </w:pPr>
             <w:r>
-              <w:t>PF</w:t>
-            </w:r>
-            <w:r>
-              <w:t xml:space="preserve"> </w:t>
-            </w:r>
-            <w:r>
-              <w:t>-04 Visualización de Agenda</w:t>
+              <w:t>PF -04 Visualización de Agenda</w:t>
             </w:r>
           </w:p>
         </w:tc>
@@ -11245,6 +11366,20 @@
             </w:pPr>
           </w:p>
         </w:tc>
+        <w:tc>
+          <w:tcPr>
+            <w:tcW w:w="1417" w:type="dxa"/>
+          </w:tcPr>
+          <w:p>
+            <w:pPr>
+              <w:pStyle w:val="TableContents"/>
+              <w:jc w:val="center"/>
+              <w:rPr>
+                <w:rFonts w:hint="eastAsia"/>
+              </w:rPr>
+            </w:pPr>
+          </w:p>
+        </w:tc>
       </w:tr>
       <w:tr>
         <w:tc>
@@ -11269,13 +11404,7 @@
               </w:rPr>
             </w:pPr>
             <w:r>
-              <w:t>PF</w:t>
-            </w:r>
-            <w:r>
-              <w:t xml:space="preserve"> </w:t>
-            </w:r>
-            <w:r>
-              <w:t>-05 Eliminación de Reserva</w:t>
+              <w:t>PF -05 Eliminación de Reserva</w:t>
             </w:r>
           </w:p>
         </w:tc>
@@ -11345,6 +11474,20 @@
             </w:pPr>
           </w:p>
         </w:tc>
+        <w:tc>
+          <w:tcPr>
+            <w:tcW w:w="1417" w:type="dxa"/>
+          </w:tcPr>
+          <w:p>
+            <w:pPr>
+              <w:pStyle w:val="TableContents"/>
+              <w:jc w:val="center"/>
+              <w:rPr>
+                <w:rFonts w:hint="eastAsia"/>
+              </w:rPr>
+            </w:pPr>
+          </w:p>
+        </w:tc>
       </w:tr>
       <w:tr>
         <w:tc>
@@ -11369,13 +11512,7 @@
               </w:rPr>
             </w:pPr>
             <w:r>
-              <w:t>PF</w:t>
-            </w:r>
-            <w:r>
-              <w:t xml:space="preserve"> </w:t>
-            </w:r>
-            <w:r>
-              <w:t>-06 Pago Stripe Sandbox</w:t>
+              <w:t>PF -06 Pago Stripe Sandbox</w:t>
             </w:r>
           </w:p>
         </w:tc>
@@ -11445,6 +11582,20 @@
             </w:r>
           </w:p>
         </w:tc>
+        <w:tc>
+          <w:tcPr>
+            <w:tcW w:w="1417" w:type="dxa"/>
+          </w:tcPr>
+          <w:p>
+            <w:pPr>
+              <w:pStyle w:val="TableContents"/>
+              <w:jc w:val="center"/>
+            </w:pPr>
+            <w:r>
+              <w:t>x</w:t>
+            </w:r>
+          </w:p>
+        </w:tc>
       </w:tr>
       <w:tr>
         <w:tc>
@@ -11467,13 +11618,7 @@
               </w:rPr>
             </w:pPr>
             <w:r>
-              <w:t>PF</w:t>
-            </w:r>
-            <w:r>
-              <w:t xml:space="preserve"> </w:t>
-            </w:r>
-            <w:r>
-              <w:t>-07 Despliegue Cloud Render</w:t>
+              <w:t>PF -07 Despliegue Cloud Render</w:t>
             </w:r>
           </w:p>
         </w:tc>
@@ -11543,6 +11688,20 @@
             </w:r>
           </w:p>
         </w:tc>
+        <w:tc>
+          <w:tcPr>
+            <w:tcW w:w="1417" w:type="dxa"/>
+          </w:tcPr>
+          <w:p>
+            <w:pPr>
+              <w:pStyle w:val="TableContents"/>
+              <w:jc w:val="center"/>
+            </w:pPr>
+            <w:r>
+              <w:t>x</w:t>
+            </w:r>
+          </w:p>
+        </w:tc>
       </w:tr>
       <w:tr>
         <w:tc>
@@ -11565,16 +11724,7 @@
               </w:rPr>
             </w:pPr>
             <w:r>
-              <w:t>PF</w:t>
-            </w:r>
-            <w:r>
-              <w:t xml:space="preserve"> </w:t>
-            </w:r>
-            <w:r>
-              <w:t xml:space="preserve">-08 </w:t>
-            </w:r>
-            <w:r>
-              <w:t>Validación de PostgreSQL.</w:t>
+              <w:t>PF-08 Persistencia de Usuarios PostgreSQL</w:t>
             </w:r>
           </w:p>
         </w:tc>
@@ -11639,6 +11789,26 @@
                 <w:rFonts w:hint="eastAsia"/>
               </w:rPr>
             </w:pPr>
+            <w:r>
+              <w:t>x</w:t>
+            </w:r>
+          </w:p>
+        </w:tc>
+        <w:tc>
+          <w:tcPr>
+            <w:tcW w:w="1417" w:type="dxa"/>
+          </w:tcPr>
+          <w:p>
+            <w:pPr>
+              <w:pStyle w:val="TableContents"/>
+              <w:jc w:val="center"/>
+              <w:rPr>
+                <w:rFonts w:hint="eastAsia"/>
+              </w:rPr>
+            </w:pPr>
+            <w:r>
+              <w:t>x</w:t>
+            </w:r>
           </w:p>
         </w:tc>
       </w:tr>
@@ -11663,16 +11833,7 @@
               </w:rPr>
             </w:pPr>
             <w:r>
-              <w:t>PF</w:t>
-            </w:r>
-            <w:r>
-              <w:t xml:space="preserve"> -</w:t>
-            </w:r>
-            <w:r>
-              <w:t xml:space="preserve">09 </w:t>
-            </w:r>
-            <w:r>
-              <w:t>Persistencia de usuarios</w:t>
+              <w:t>PF-09 Persistencia de Reservas PostgreSQL</w:t>
             </w:r>
           </w:p>
         </w:tc>
@@ -11737,6 +11898,26 @@
                 <w:rFonts w:hint="eastAsia"/>
               </w:rPr>
             </w:pPr>
+            <w:r>
+              <w:t>x</w:t>
+            </w:r>
+          </w:p>
+        </w:tc>
+        <w:tc>
+          <w:tcPr>
+            <w:tcW w:w="1417" w:type="dxa"/>
+          </w:tcPr>
+          <w:p>
+            <w:pPr>
+              <w:pStyle w:val="TableContents"/>
+              <w:jc w:val="center"/>
+              <w:rPr>
+                <w:rFonts w:hint="eastAsia"/>
+              </w:rPr>
+            </w:pPr>
+            <w:r>
+              <w:t>x</w:t>
+            </w:r>
           </w:p>
         </w:tc>
       </w:tr>
@@ -11761,16 +11942,7 @@
               </w:rPr>
             </w:pPr>
             <w:r>
-              <w:t>PF</w:t>
-            </w:r>
-            <w:r>
-              <w:t xml:space="preserve"> </w:t>
-            </w:r>
-            <w:r>
-              <w:t xml:space="preserve">-10 </w:t>
-            </w:r>
-            <w:r>
-              <w:t>Validación de migraciones Django.</w:t>
+              <w:t>PF-10 Visualización de Usuarios en Django Admin</w:t>
             </w:r>
           </w:p>
         </w:tc>
@@ -11835,20 +12007,14 @@
                 <w:rFonts w:hint="eastAsia"/>
               </w:rPr>
             </w:pPr>
-          </w:p>
-        </w:tc>
-      </w:tr>
-      <w:tr>
-        <w:tc>
-          <w:tcPr>
-            <w:tcW w:w="1696" w:type="dxa"/>
-            <w:tcMar>
-              <w:top w:w="55" w:type="dxa"/>
-              <w:left w:w="55" w:type="dxa"/>
-              <w:bottom w:w="55" w:type="dxa"/>
-              <w:right w:w="55" w:type="dxa"/>
-            </w:tcMar>
-            <w:vAlign w:val="center"/>
+            <w:r>
+              <w:t>x</w:t>
+            </w:r>
+          </w:p>
+        </w:tc>
+        <w:tc>
+          <w:tcPr>
+            <w:tcW w:w="1417" w:type="dxa"/>
           </w:tcPr>
           <w:p>
             <w:pPr>
@@ -11859,92 +12025,12 @@
               </w:rPr>
             </w:pPr>
             <w:r>
-              <w:t>PF</w:t>
-            </w:r>
-            <w:r>
-              <w:t xml:space="preserve"> </w:t>
-            </w:r>
-            <w:r>
-              <w:t xml:space="preserve">-11 </w:t>
-            </w:r>
-            <w:r>
-              <w:t>Pruebas de administración.</w:t>
-            </w:r>
-          </w:p>
-        </w:tc>
-        <w:tc>
-          <w:tcPr>
-            <w:tcW w:w="993" w:type="dxa"/>
-            <w:tcMar>
-              <w:top w:w="55" w:type="dxa"/>
-              <w:left w:w="55" w:type="dxa"/>
-              <w:bottom w:w="55" w:type="dxa"/>
-              <w:right w:w="55" w:type="dxa"/>
-            </w:tcMar>
-            <w:vAlign w:val="center"/>
-          </w:tcPr>
-          <w:p>
-            <w:pPr>
-              <w:pStyle w:val="TableContents"/>
-              <w:jc w:val="center"/>
-              <w:rPr>
-                <w:rFonts w:hint="eastAsia"/>
-              </w:rPr>
-            </w:pPr>
-          </w:p>
-        </w:tc>
-        <w:tc>
-          <w:tcPr>
-            <w:tcW w:w="1134" w:type="dxa"/>
-            <w:tcMar>
-              <w:top w:w="55" w:type="dxa"/>
-              <w:left w:w="55" w:type="dxa"/>
-              <w:bottom w:w="55" w:type="dxa"/>
-              <w:right w:w="55" w:type="dxa"/>
-            </w:tcMar>
-            <w:vAlign w:val="center"/>
-          </w:tcPr>
-          <w:p>
-            <w:pPr>
-              <w:pStyle w:val="TableContents"/>
-              <w:jc w:val="center"/>
-              <w:rPr>
-                <w:rFonts w:hint="eastAsia"/>
-              </w:rPr>
-            </w:pPr>
-          </w:p>
-        </w:tc>
-        <w:tc>
-          <w:tcPr>
-            <w:tcW w:w="1417" w:type="dxa"/>
-            <w:tcMar>
-              <w:top w:w="55" w:type="dxa"/>
-              <w:left w:w="55" w:type="dxa"/>
-              <w:bottom w:w="55" w:type="dxa"/>
-              <w:right w:w="55" w:type="dxa"/>
-            </w:tcMar>
-            <w:vAlign w:val="center"/>
-          </w:tcPr>
-          <w:p>
-            <w:pPr>
-              <w:pStyle w:val="TableContents"/>
-              <w:jc w:val="center"/>
-              <w:rPr>
-                <w:rFonts w:hint="eastAsia"/>
-              </w:rPr>
-            </w:pPr>
+              <w:t>x</w:t>
+            </w:r>
           </w:p>
         </w:tc>
       </w:tr>
     </w:tbl>
-    <w:p>
-      <w:pPr>
-        <w:pStyle w:val="Textbody"/>
-        <w:rPr>
-          <w:rFonts w:hint="eastAsia"/>
-        </w:rPr>
-      </w:pPr>
-    </w:p>
     <w:p>
       <w:pPr>
         <w:pStyle w:val="Textbody"/>
@@ -12787,25 +12873,7 @@
           <w:color w:val="000000"/>
           <w:lang w:val="es-CL"/>
         </w:rPr>
-        <w:t xml:space="preserve">Capturas de pantalla de la aplicación ejecutándose en ambiente </w:t>
-      </w:r>
-      <w:proofErr w:type="spellStart"/>
-      <w:r>
-        <w:rPr>
-          <w:rFonts w:cs="Arial"/>
-          <w:color w:val="000000"/>
-          <w:lang w:val="es-CL"/>
-        </w:rPr>
-        <w:t>cloud</w:t>
-      </w:r>
-      <w:proofErr w:type="spellEnd"/>
-      <w:r>
-        <w:rPr>
-          <w:rFonts w:cs="Arial"/>
-          <w:color w:val="000000"/>
-          <w:lang w:val="es-CL"/>
-        </w:rPr>
-        <w:t xml:space="preserve"> mediante Render, incluyendo acceso desde Internet.</w:t>
+        <w:t>Capturas de pantalla de la aplicación ejecutándose en ambiente cloud mediante Render, incluyendo acceso desde Internet.</w:t>
       </w:r>
     </w:p>
     <w:p>
@@ -13101,11 +13169,134 @@
     <w:p>
       <w:pPr>
         <w:pStyle w:val="Textbody"/>
+        <w:ind w:left="360"/>
+        <w:rPr>
+          <w:rFonts w:cs="Arial" w:hint="eastAsia"/>
+          <w:b/>
+          <w:bCs/>
+          <w:color w:val="000000"/>
+          <w:lang w:val="es-CL"/>
+        </w:rPr>
+      </w:pPr>
+      <w:r>
+        <w:rPr>
+          <w:rFonts w:cs="Arial"/>
+          <w:b/>
+          <w:bCs/>
+          <w:color w:val="000000"/>
+          <w:lang w:val="es-CL"/>
+        </w:rPr>
+        <w:lastRenderedPageBreak/>
+        <w:t xml:space="preserve">Anexo </w:t>
+      </w:r>
+      <w:r>
+        <w:rPr>
+          <w:rFonts w:cs="Arial"/>
+          <w:b/>
+          <w:bCs/>
+          <w:color w:val="000000"/>
+          <w:lang w:val="es-CL"/>
+        </w:rPr>
+        <w:t>i</w:t>
+      </w:r>
+      <w:r>
+        <w:rPr>
+          <w:rFonts w:cs="Arial"/>
+          <w:b/>
+          <w:bCs/>
+          <w:color w:val="000000"/>
+          <w:lang w:val="es-CL"/>
+        </w:rPr>
+        <w:t xml:space="preserve">: Evidencia </w:t>
+      </w:r>
+      <w:r>
+        <w:rPr>
+          <w:rFonts w:cs="Arial"/>
+          <w:b/>
+          <w:bCs/>
+          <w:color w:val="000000"/>
+          <w:lang w:val="es-CL"/>
+        </w:rPr>
+        <w:t xml:space="preserve">de Pagina admin </w:t>
+      </w:r>
+    </w:p>
+    <w:p>
+      <w:pPr>
+        <w:pStyle w:val="Textbody"/>
+        <w:rPr>
+          <w:rFonts w:cs="Arial"/>
+          <w:color w:val="000000"/>
+          <w:lang w:val="es-CL"/>
+        </w:rPr>
+      </w:pPr>
+      <w:r>
+        <w:rPr>
+          <w:rFonts w:cs="Arial"/>
+          <w:color w:val="000000"/>
+          <w:lang w:val="es-CL"/>
+        </w:rPr>
+        <w:t>Capturas de pantalla del panel de administración</w:t>
+      </w:r>
+      <w:r>
+        <w:rPr>
+          <w:rFonts w:cs="Arial"/>
+          <w:color w:val="000000"/>
+          <w:lang w:val="es-CL"/>
+        </w:rPr>
+        <w:t xml:space="preserve"> 0 registro de las reservas que fueron creadas y están registradas en el base de datos.</w:t>
+      </w:r>
+    </w:p>
+    <w:p>
+      <w:pPr>
+        <w:pStyle w:val="Textbody"/>
         <w:rPr>
           <w:rFonts w:cs="Arial" w:hint="eastAsia"/>
           <w:color w:val="000000"/>
-        </w:rPr>
-      </w:pPr>
+          <w:lang w:val="es-CL"/>
+        </w:rPr>
+      </w:pPr>
+      <w:r>
+        <w:rPr>
+          <w:rFonts w:cs="Arial"/>
+          <w:color w:val="000000"/>
+          <w:lang w:val="es-CL"/>
+        </w:rPr>
+        <w:drawing>
+          <wp:inline distT="0" distB="0" distL="0" distR="0" wp14:anchorId="30C7DE7E" wp14:editId="79971720">
+            <wp:extent cx="5760085" cy="2804160"/>
+            <wp:effectExtent l="0" t="0" r="0" b="0"/>
+            <wp:docPr id="1866429006" name="Imagen 1"/>
+            <wp:cNvGraphicFramePr>
+              <a:graphicFrameLocks xmlns:a="http://schemas.openxmlformats.org/drawingml/2006/main" noChangeAspect="1"/>
+            </wp:cNvGraphicFramePr>
+            <a:graphic xmlns:a="http://schemas.openxmlformats.org/drawingml/2006/main">
+              <a:graphicData uri="http://schemas.openxmlformats.org/drawingml/2006/picture">
+                <pic:pic xmlns:pic="http://schemas.openxmlformats.org/drawingml/2006/picture">
+                  <pic:nvPicPr>
+                    <pic:cNvPr id="1866429006" name=""/>
+                    <pic:cNvPicPr/>
+                  </pic:nvPicPr>
+                  <pic:blipFill>
+                    <a:blip r:embed="rId21"/>
+                    <a:stretch>
+                      <a:fillRect/>
+                    </a:stretch>
+                  </pic:blipFill>
+                  <pic:spPr>
+                    <a:xfrm>
+                      <a:off x="0" y="0"/>
+                      <a:ext cx="5760085" cy="2804160"/>
+                    </a:xfrm>
+                    <a:prstGeom prst="rect">
+                      <a:avLst/>
+                    </a:prstGeom>
+                  </pic:spPr>
+                </pic:pic>
+              </a:graphicData>
+            </a:graphic>
+          </wp:inline>
+        </w:drawing>
+      </w:r>
     </w:p>
     <w:p>
       <w:pPr>
@@ -13687,15 +13878,7 @@
               </w:rPr>
             </w:pPr>
             <w:r>
-              <w:t xml:space="preserve">Plataforma </w:t>
-            </w:r>
-            <w:proofErr w:type="spellStart"/>
-            <w:r>
-              <w:t>cloud</w:t>
-            </w:r>
-            <w:proofErr w:type="spellEnd"/>
-            <w:r>
-              <w:t xml:space="preserve"> para despliegue de aplicaciones</w:t>
+              <w:t>Plataforma cloud para despliegue de aplicaciones</w:t>
             </w:r>
           </w:p>
         </w:tc>
@@ -13897,8 +14080,8 @@
       <w:bookmarkEnd w:id="8"/>
     </w:p>
     <w:sectPr>
-      <w:headerReference w:type="default" r:id="rId21"/>
-      <w:footerReference w:type="default" r:id="rId22"/>
+      <w:headerReference w:type="default" r:id="rId22"/>
+      <w:footerReference w:type="default" r:id="rId23"/>
       <w:pgSz w:w="11906" w:h="16838"/>
       <w:pgMar w:top="1474" w:right="1134" w:bottom="1134" w:left="1701" w:header="1134" w:footer="720" w:gutter="0"/>
       <w:cols w:space="720"/>
@@ -16233,6 +16416,95 @@
     </w:lvl>
   </w:abstractNum>
   <w:abstractNum w:abstractNumId="22" w15:restartNumberingAfterBreak="0">
+    <w:nsid w:val="6BEE5681"/>
+    <w:multiLevelType w:val="hybridMultilevel"/>
+    <w:tmpl w:val="111CB828"/>
+    <w:lvl w:ilvl="0" w:tplc="D4E03178">
+      <w:start w:val="1"/>
+      <w:numFmt w:val="decimal"/>
+      <w:lvlText w:val="%1."/>
+      <w:lvlJc w:val="left"/>
+      <w:pPr>
+        <w:ind w:left="417" w:hanging="360"/>
+      </w:pPr>
+      <w:rPr>
+        <w:rFonts w:hint="default"/>
+      </w:rPr>
+    </w:lvl>
+    <w:lvl w:ilvl="1" w:tplc="340A0019" w:tentative="1">
+      <w:start w:val="1"/>
+      <w:numFmt w:val="lowerLetter"/>
+      <w:lvlText w:val="%2."/>
+      <w:lvlJc w:val="left"/>
+      <w:pPr>
+        <w:ind w:left="1137" w:hanging="360"/>
+      </w:pPr>
+    </w:lvl>
+    <w:lvl w:ilvl="2" w:tplc="340A001B" w:tentative="1">
+      <w:start w:val="1"/>
+      <w:numFmt w:val="lowerRoman"/>
+      <w:lvlText w:val="%3."/>
+      <w:lvlJc w:val="right"/>
+      <w:pPr>
+        <w:ind w:left="1857" w:hanging="180"/>
+      </w:pPr>
+    </w:lvl>
+    <w:lvl w:ilvl="3" w:tplc="340A000F" w:tentative="1">
+      <w:start w:val="1"/>
+      <w:numFmt w:val="decimal"/>
+      <w:lvlText w:val="%4."/>
+      <w:lvlJc w:val="left"/>
+      <w:pPr>
+        <w:ind w:left="2577" w:hanging="360"/>
+      </w:pPr>
+    </w:lvl>
+    <w:lvl w:ilvl="4" w:tplc="340A0019" w:tentative="1">
+      <w:start w:val="1"/>
+      <w:numFmt w:val="lowerLetter"/>
+      <w:lvlText w:val="%5."/>
+      <w:lvlJc w:val="left"/>
+      <w:pPr>
+        <w:ind w:left="3297" w:hanging="360"/>
+      </w:pPr>
+    </w:lvl>
+    <w:lvl w:ilvl="5" w:tplc="340A001B" w:tentative="1">
+      <w:start w:val="1"/>
+      <w:numFmt w:val="lowerRoman"/>
+      <w:lvlText w:val="%6."/>
+      <w:lvlJc w:val="right"/>
+      <w:pPr>
+        <w:ind w:left="4017" w:hanging="180"/>
+      </w:pPr>
+    </w:lvl>
+    <w:lvl w:ilvl="6" w:tplc="340A000F" w:tentative="1">
+      <w:start w:val="1"/>
+      <w:numFmt w:val="decimal"/>
+      <w:lvlText w:val="%7."/>
+      <w:lvlJc w:val="left"/>
+      <w:pPr>
+        <w:ind w:left="4737" w:hanging="360"/>
+      </w:pPr>
+    </w:lvl>
+    <w:lvl w:ilvl="7" w:tplc="340A0019" w:tentative="1">
+      <w:start w:val="1"/>
+      <w:numFmt w:val="lowerLetter"/>
+      <w:lvlText w:val="%8."/>
+      <w:lvlJc w:val="left"/>
+      <w:pPr>
+        <w:ind w:left="5457" w:hanging="360"/>
+      </w:pPr>
+    </w:lvl>
+    <w:lvl w:ilvl="8" w:tplc="340A001B" w:tentative="1">
+      <w:start w:val="1"/>
+      <w:numFmt w:val="lowerRoman"/>
+      <w:lvlText w:val="%9."/>
+      <w:lvlJc w:val="right"/>
+      <w:pPr>
+        <w:ind w:left="6177" w:hanging="180"/>
+      </w:pPr>
+    </w:lvl>
+  </w:abstractNum>
+  <w:abstractNum w:abstractNumId="23" w15:restartNumberingAfterBreak="0">
     <w:nsid w:val="7C61754E"/>
     <w:multiLevelType w:val="hybridMultilevel"/>
     <w:tmpl w:val="87F8BCA4"/>
@@ -16343,7 +16615,7 @@
     <w:abstractNumId w:val="11"/>
   </w:num>
   <w:num w:numId="9" w16cid:durableId="226454641">
-    <w:abstractNumId w:val="22"/>
+    <w:abstractNumId w:val="23"/>
   </w:num>
   <w:num w:numId="10" w16cid:durableId="60518254">
     <w:abstractNumId w:val="4"/>
@@ -16386,6 +16658,9 @@
   </w:num>
   <w:num w:numId="23" w16cid:durableId="824393221">
     <w:abstractNumId w:val="5"/>
+  </w:num>
+  <w:num w:numId="24" w16cid:durableId="1791432117">
+    <w:abstractNumId w:val="22"/>
   </w:num>
 </w:numbering>
 </file>
@@ -16906,7 +17181,6 @@
   <w:style w:type="character" w:default="1" w:styleId="Fuentedeprrafopredeter">
     <w:name w:val="Default Paragraph Font"/>
     <w:uiPriority w:val="1"/>
-    <w:semiHidden/>
     <w:unhideWhenUsed/>
   </w:style>
   <w:style w:type="table" w:default="1" w:styleId="Tablanormal">

</xml_diff>